<commit_message>
recode the front-end page
</commit_message>
<xml_diff>
--- a/项目文档/软件2413 张佛亮 毕业设计(论文)开题报告 .docx
+++ b/项目文档/软件2413 张佛亮 毕业设计(论文)开题报告 .docx
@@ -70,6 +70,8 @@
         <w:spacing w:after="240"/>
         <w:jc w:val="both"/>
       </w:pPr>
+      <w:bookmarkStart w:id="0" w:name="_GoBack"/>
+      <w:bookmarkEnd w:id="0"/>
     </w:p>
     <w:p>
       <w:pPr>
@@ -1264,8 +1266,6 @@
       <w:r>
         <w:rPr>
           <w:rFonts w:ascii="Times New Roman" w:hAnsi="Times New Roman" w:eastAsia="宋体"/>
-          <w:b/>
-          <w:bCs/>
           <w:sz w:val="24"/>
           <w:szCs w:val="24"/>
         </w:rPr>
@@ -1288,8 +1288,6 @@
       <w:r>
         <w:rPr>
           <w:rFonts w:ascii="Times New Roman" w:hAnsi="Times New Roman" w:eastAsia="宋体"/>
-          <w:b/>
-          <w:bCs/>
           <w:sz w:val="24"/>
           <w:szCs w:val="24"/>
         </w:rPr>
@@ -1312,8 +1310,6 @@
       <w:r>
         <w:rPr>
           <w:rFonts w:ascii="Times New Roman" w:hAnsi="Times New Roman" w:eastAsia="宋体"/>
-          <w:b/>
-          <w:bCs/>
           <w:sz w:val="24"/>
           <w:szCs w:val="24"/>
         </w:rPr>
@@ -1336,8 +1332,6 @@
       <w:r>
         <w:rPr>
           <w:rFonts w:ascii="Times New Roman" w:hAnsi="Times New Roman" w:eastAsia="宋体"/>
-          <w:b/>
-          <w:bCs/>
           <w:sz w:val="24"/>
           <w:szCs w:val="24"/>
         </w:rPr>
@@ -1360,8 +1354,6 @@
       <w:r>
         <w:rPr>
           <w:rFonts w:ascii="Times New Roman" w:hAnsi="Times New Roman" w:eastAsia="宋体"/>
-          <w:b/>
-          <w:bCs/>
           <w:sz w:val="24"/>
           <w:szCs w:val="24"/>
         </w:rPr>
@@ -1384,8 +1376,6 @@
       <w:r>
         <w:rPr>
           <w:rFonts w:ascii="Times New Roman" w:hAnsi="Times New Roman" w:eastAsia="宋体"/>
-          <w:b/>
-          <w:bCs/>
           <w:sz w:val="24"/>
           <w:szCs w:val="24"/>
         </w:rPr>
@@ -1408,8 +1398,6 @@
       <w:r>
         <w:rPr>
           <w:rFonts w:ascii="Times New Roman" w:hAnsi="Times New Roman" w:eastAsia="宋体"/>
-          <w:b/>
-          <w:bCs/>
           <w:sz w:val="24"/>
           <w:szCs w:val="24"/>
         </w:rPr>
@@ -1432,8 +1420,6 @@
       <w:r>
         <w:rPr>
           <w:rFonts w:ascii="Times New Roman" w:hAnsi="Times New Roman" w:eastAsia="宋体"/>
-          <w:b/>
-          <w:bCs/>
           <w:sz w:val="24"/>
           <w:szCs w:val="24"/>
         </w:rPr>
@@ -1456,8 +1442,6 @@
       <w:r>
         <w:rPr>
           <w:rFonts w:ascii="Times New Roman" w:hAnsi="Times New Roman" w:eastAsia="宋体"/>
-          <w:b/>
-          <w:bCs/>
           <w:sz w:val="24"/>
           <w:szCs w:val="24"/>
         </w:rPr>
@@ -1519,7 +1503,6 @@
           <w:lang w:val="en-US" w:eastAsia="zh-CN" w:bidi="ar-SA"/>
         </w:rPr>
       </w:pPr>
-      <w:bookmarkStart w:id="0" w:name="_GoBack"/>
       <w:r>
         <w:rPr>
           <w:rFonts w:hint="default" w:ascii="Times New Roman" w:hAnsi="Times New Roman" w:eastAsia="黑体" w:cs="Times New Roman"/>
@@ -1531,7 +1514,6 @@
         <w:t>四、参考文献</w:t>
       </w:r>
     </w:p>
-    <w:bookmarkEnd w:id="0"/>
     <w:p>
       <w:pPr>
         <w:numPr>

</xml_diff>